<commit_message>
Re-plot PR curve and confusion matrix for one-column legibility
The harness's stock plots are sized for 9-12 inch figures; scaled into a
3.25 inch IEEE column their labels rendered at roughly 3.5 pt — below
anything a reviewer can read in print. Both are now re-plotted from the
harness's own arrays (box.curves_results and confusion_matrix.matrix) at
column size with 6-8 pt type, so the numbers are identical and the
typography is legible: verified by cropping the placed images out of the
rendered PDF at print scale.

Note for reproduction: the confusion matrix only accumulates when val()
runs with plots=True; with plots=False it stays all-zero, which is what
the first attempt silently produced.

Still 6 pages.

Co-Authored-By: Claude Fable 5 <noreply@anthropic.com>
</commit_message>
<xml_diff>
--- a/docs/ICIICTE2026_paper.docx
+++ b/docs/ICIICTE2026_paper.docx
@@ -5855,7 +5855,7 @@
       <w:r>
         <w:drawing>
           <wp:inline distT="0" distB="0" distL="0" distR="0">
-            <wp:extent cx="2971800" cy="1981200"/>
+            <wp:extent cx="2971800" cy="2219325"/>
             <wp:effectExtent t="0" r="0" b="0" l="0"/>
             <wp:docPr id="1" name="" descr="" title=""/>
             <wp:cNvGraphicFramePr>
@@ -5880,7 +5880,7 @@
                   <pic:spPr bwMode="auto">
                     <a:xfrm>
                       <a:off x="0" y="0"/>
-                      <a:ext cx="2971800" cy="1981200"/>
+                      <a:ext cx="2971800" cy="2219325"/>
                     </a:xfrm>
                     <a:prstGeom prst="rect">
                       <a:avLst/>
@@ -5919,7 +5919,7 @@
       <w:r>
         <w:drawing>
           <wp:inline distT="0" distB="0" distL="0" distR="0">
-            <wp:extent cx="2971800" cy="2228850"/>
+            <wp:extent cx="2971800" cy="2571750"/>
             <wp:effectExtent t="0" r="0" b="0" l="0"/>
             <wp:docPr id="1" name="" descr="" title=""/>
             <wp:cNvGraphicFramePr>
@@ -5944,7 +5944,7 @@
                   <pic:spPr bwMode="auto">
                     <a:xfrm>
                       <a:off x="0" y="0"/>
-                      <a:ext cx="2971800" cy="2228850"/>
+                      <a:ext cx="2971800" cy="2571750"/>
                     </a:xfrm>
                     <a:prstGeom prst="rect">
                       <a:avLst/>

</xml_diff>